<commit_message>
Fix center text for hero p plus revised couples contract wording
</commit_message>
<xml_diff>
--- a/dist/Couples Therapy Contract.docx
+++ b/dist/Couples Therapy Contract.docx
@@ -1041,35 +1041,7 @@
         <w:rPr>
           <w:rFonts w:eastAsia="Times New Roman"/>
         </w:rPr>
-        <w:t xml:space="preserve">Couples therapy is a collaborative process designed to help partners better understand their relationship patterns, improve communication, address conflict, and work toward mutually agreed goals. In couples therapy, </w:t>
-      </w:r>
-      <w:r>
-        <w:rPr>
-          <w:rFonts w:eastAsia="Times New Roman"/>
-          <w:b/>
-          <w:bCs/>
-        </w:rPr>
-        <w:t>the relationship itself is considered the client</w:t>
-      </w:r>
-      <w:r>
-        <w:rPr>
-          <w:rFonts w:eastAsia="Times New Roman"/>
-        </w:rPr>
-        <w:t xml:space="preserve">, and the work focuses on the wellbeing of the relationship as well as each partner’s experience within it. The primary goal is to </w:t>
-      </w:r>
-      <w:r>
-        <w:rPr>
-          <w:rFonts w:eastAsia="Times New Roman"/>
-          <w:b/>
-          <w:bCs/>
-        </w:rPr>
-        <w:t>support both partners in creating a healthier, more functional relationship</w:t>
-      </w:r>
-      <w:r>
-        <w:rPr>
-          <w:rFonts w:eastAsia="Times New Roman"/>
-        </w:rPr>
-        <w:t>, repair trust, and build skills for ongoing communication and problem-solving.</w:t>
+        <w:t>Couples therapy is a collaborative process designed to help partners better understand their relationship patterns, improve communication, address conflict, and work toward mutually agreed goals. In couples therapy, the relationship itself is considered the client, and the work focuses on the wellbeing of the relationship as well as each partner’s experience within it. The primary goal is to support both partners in creating a healthier, more functional relationship, repair trust, and build skills for ongoing communication and problem-solving.</w:t>
       </w:r>
     </w:p>
     <w:p>
@@ -1097,8 +1069,8 @@
           <w:sz w:val="24"/>
           <w:szCs w:val="24"/>
         </w:rPr>
-        <w:pict w14:anchorId="062E1952">
-          <v:rect id="_x0000_i1032" alt="" style="width:362.4pt;height:.05pt;mso-width-percent:0;mso-height-percent:0;mso-width-percent:0;mso-height-percent:0" o:hrpct="803" o:hralign="center" o:hrstd="t" o:hr="t" fillcolor="#a0a0a0" stroked="f"/>
+        <w:pict w14:anchorId="1A32973B">
+          <v:rect id="_x0000_i1032" alt="" style="width:347.05pt;height:.05pt;mso-width-percent:0;mso-height-percent:0;mso-width-percent:0;mso-height-percent:0" o:hrpct="769" o:hralign="center" o:hrstd="t" o:hr="t" fillcolor="#a0a0a0" stroked="f"/>
         </w:pict>
       </w:r>
     </w:p>
@@ -1154,8 +1126,6 @@
       <w:r>
         <w:rPr>
           <w:rFonts w:eastAsia="Times New Roman"/>
-          <w:b/>
-          <w:bCs/>
         </w:rPr>
         <w:t>overall goals of couples therapy</w:t>
       </w:r>
@@ -1291,49 +1261,25 @@
         <w:rPr>
           <w:rFonts w:eastAsia="Times New Roman"/>
         </w:rPr>
-        <w:t xml:space="preserve">Individual sessions are </w:t>
-      </w:r>
-      <w:r>
-        <w:rPr>
-          <w:rFonts w:eastAsia="Times New Roman"/>
-          <w:b/>
-          <w:bCs/>
-        </w:rPr>
-        <w:t>part of the couples therapy process</w:t>
-      </w:r>
-      <w:r>
-        <w:rPr>
-          <w:rFonts w:eastAsia="Times New Roman"/>
-        </w:rPr>
-        <w:t xml:space="preserve"> and are subject to the </w:t>
-      </w:r>
-      <w:r>
-        <w:rPr>
-          <w:rFonts w:eastAsia="Times New Roman"/>
-          <w:b/>
-          <w:bCs/>
-        </w:rPr>
-        <w:t>No Secrets Policy</w:t>
-      </w:r>
-      <w:r>
-        <w:rPr>
-          <w:rFonts w:eastAsia="Times New Roman"/>
-        </w:rPr>
-        <w:t xml:space="preserve">. If a partner requires personal therapy </w:t>
-      </w:r>
-      <w:r>
-        <w:rPr>
-          <w:rFonts w:eastAsia="Times New Roman"/>
-          <w:b/>
-          <w:bCs/>
-        </w:rPr>
-        <w:t>unrelated to couples work</w:t>
-      </w:r>
-      <w:r>
-        <w:rPr>
-          <w:rFonts w:eastAsia="Times New Roman"/>
-        </w:rPr>
-        <w:t xml:space="preserve"> or wishes to continue individual therapy after couples therapy ends, I will </w:t>
+        <w:t>Please see the information below about confidentiality of individual sessions</w:t>
+      </w:r>
+      <w:r>
+        <w:rPr>
+          <w:rFonts w:eastAsia="Times New Roman"/>
+        </w:rPr>
+        <w:t>. If a partner requires personal thera</w:t>
+      </w:r>
+      <w:r>
+        <w:rPr>
+          <w:rFonts w:eastAsia="Times New Roman"/>
+        </w:rPr>
+        <w:t>py unrelated to couples work or</w:t>
+      </w:r>
+      <w:r>
+        <w:rPr>
+          <w:rFonts w:eastAsia="Times New Roman"/>
+        </w:rPr>
+        <w:t xml:space="preserve"> wishes to continue individual therapy after couples therapy ends, I will </w:t>
       </w:r>
       <w:r>
         <w:rPr>
@@ -1375,8 +1321,8 @@
           <w:sz w:val="24"/>
           <w:szCs w:val="24"/>
         </w:rPr>
-        <w:pict w14:anchorId="7F314635">
-          <v:rect id="_x0000_i1031" alt="" style="width:362.4pt;height:.05pt;mso-width-percent:0;mso-height-percent:0;mso-width-percent:0;mso-height-percent:0" o:hrpct="803" o:hralign="center" o:hrstd="t" o:hr="t" fillcolor="#a0a0a0" stroked="f"/>
+        <w:pict w14:anchorId="35170C7F">
+          <v:rect id="_x0000_i1031" alt="" style="width:347.05pt;height:.05pt;mso-width-percent:0;mso-height-percent:0;mso-width-percent:0;mso-height-percent:0" o:hrpct="769" o:hralign="center" o:hrstd="t" o:hr="t" fillcolor="#a0a0a0" stroked="f"/>
         </w:pict>
       </w:r>
     </w:p>
@@ -1425,30 +1371,90 @@
         <w:spacing w:before="240" w:after="240" w:line="240" w:lineRule="auto"/>
         <w:rPr>
           <w:rStyle w:val="bzpyqfadein"/>
-          <w:rFonts w:ascii="Times New Roman" w:eastAsia="Times New Roman" w:hAnsi="Times New Roman" w:cs="Times New Roman"/>
-          <w:color w:val="auto"/>
-          <w:sz w:val="24"/>
-          <w:szCs w:val="24"/>
-        </w:rPr>
-      </w:pPr>
-      <w:r>
-        <w:rPr>
-          <w:rFonts w:ascii="Times New Roman" w:eastAsia="Times New Roman" w:hAnsi="Times New Roman" w:cs="Times New Roman"/>
-          <w:sz w:val="24"/>
-          <w:szCs w:val="24"/>
-        </w:rPr>
-        <w:t>All therapy sessions are confidential within legal and ethical limits. Exceptions include situations where there is a risk of harm to yourself or others, or where disclosure is required by law or professional ethics.</w:t>
+          <w:rFonts w:eastAsia="Times New Roman"/>
+          <w:color w:val="auto"/>
+        </w:rPr>
+      </w:pPr>
+      <w:r>
+        <w:rPr>
+          <w:rFonts w:eastAsia="Times New Roman"/>
+          <w:b/>
+          <w:bCs/>
+        </w:rPr>
+        <w:t>All therapy sessions are confidential within legal and ethical limits</w:t>
+      </w:r>
+      <w:r>
+        <w:rPr>
+          <w:rFonts w:eastAsia="Times New Roman"/>
+        </w:rPr>
+        <w:t xml:space="preserve">. Exceptions include situations where there is a risk of harm to </w:t>
+      </w:r>
+      <w:r>
+        <w:rPr>
+          <w:rFonts w:eastAsia="Times New Roman"/>
+        </w:rPr>
+        <w:t>themselves</w:t>
+      </w:r>
+      <w:r>
+        <w:rPr>
+          <w:rFonts w:eastAsia="Times New Roman"/>
+        </w:rPr>
+        <w:t xml:space="preserve"> or others, or where disclosure is required by law or professional ethics.</w:t>
       </w:r>
     </w:p>
     <w:p>
       <w:pPr>
         <w:pStyle w:val="NormalWeb"/>
+        <w:rPr>
+          <w:rFonts w:ascii="Arial" w:hAnsi="Arial" w:cs="Arial"/>
+          <w:sz w:val="22"/>
+          <w:szCs w:val="22"/>
+        </w:rPr>
       </w:pPr>
       <w:r>
         <w:rPr>
           <w:rStyle w:val="bzpyqfadein"/>
-        </w:rPr>
-        <w:t>Honesty and transparency are foundational to effective couples therapy. If one partner shares information in an individual session that significantly impacts the relationship—such as an ongoing affair, undisclosed contact with a third party, hidden financial activity, major deception, secret plans to end the relationship, or other serious breaches of trust — I will encourage and support that partner in bringing this issue into joint sessions. However, if they wish the information to remain confidential, therapy may be paused until the matter can be addressed openly, or it may not be possible to continue with the therapy.</w:t>
+          <w:rFonts w:ascii="Arial" w:hAnsi="Arial" w:cs="Arial"/>
+          <w:sz w:val="22"/>
+          <w:szCs w:val="22"/>
+        </w:rPr>
+        <w:t xml:space="preserve">Honesty and transparency are foundational to effective couples therapy. If one partner shares information </w:t>
+      </w:r>
+      <w:r>
+        <w:rPr>
+          <w:rStyle w:val="bzpyqfadein"/>
+          <w:rFonts w:ascii="Arial" w:hAnsi="Arial" w:cs="Arial"/>
+          <w:sz w:val="22"/>
+          <w:szCs w:val="22"/>
+        </w:rPr>
+        <w:t xml:space="preserve">on an individual basis </w:t>
+      </w:r>
+      <w:r>
+        <w:rPr>
+          <w:rStyle w:val="bzpyqfadein"/>
+          <w:rFonts w:ascii="Arial" w:hAnsi="Arial" w:cs="Arial"/>
+          <w:sz w:val="22"/>
+          <w:szCs w:val="22"/>
+        </w:rPr>
+        <w:t>that significantly impacts the relationship—such as an ongoing affair, undisclosed contact with a third party, hidden financial activity, major deception, secret plans to end the relationship, or other serious breaches of trust</w:t>
+      </w:r>
+      <w:r>
+        <w:rPr>
+          <w:rStyle w:val="bzpyqfadein"/>
+          <w:rFonts w:ascii="Arial" w:hAnsi="Arial" w:cs="Arial"/>
+          <w:sz w:val="22"/>
+          <w:szCs w:val="22"/>
+        </w:rPr>
+        <w:t xml:space="preserve"> </w:t>
+      </w:r>
+      <w:r>
+        <w:rPr>
+          <w:rStyle w:val="bzpyqfadein"/>
+          <w:rFonts w:ascii="Arial" w:hAnsi="Arial" w:cs="Arial"/>
+          <w:sz w:val="22"/>
+          <w:szCs w:val="22"/>
+        </w:rPr>
+        <w:t>— I will encourage and support that partner in bringing this issue into joint sessions. However, if they wish the information to remain confidential, therapy may be paused until the matter can be addressed openly, or it may not be possible to continue with the therapy.</w:t>
       </w:r>
     </w:p>
     <w:p>
@@ -1494,8 +1500,8 @@
           <w:sz w:val="24"/>
           <w:szCs w:val="24"/>
         </w:rPr>
-        <w:pict w14:anchorId="17A23F8B">
-          <v:rect id="_x0000_i1030" alt="" style="width:362.4pt;height:.05pt;mso-width-percent:0;mso-height-percent:0;mso-width-percent:0;mso-height-percent:0" o:hrpct="803" o:hralign="center" o:hrstd="t" o:hr="t" fillcolor="#a0a0a0" stroked="f"/>
+        <w:pict w14:anchorId="1066FC36">
+          <v:rect id="_x0000_i1030" alt="" style="width:347.05pt;height:.05pt;mso-width-percent:0;mso-height-percent:0;mso-width-percent:0;mso-height-percent:0" o:hrpct="769" o:hralign="center" o:hrstd="t" o:hr="t" fillcolor="#a0a0a0" stroked="f"/>
         </w:pict>
       </w:r>
     </w:p>
@@ -1522,6 +1528,7 @@
           <w:b/>
           <w:bCs/>
         </w:rPr>
+        <w:lastRenderedPageBreak/>
         <w:t>Respectful Communication and Safety</w:t>
       </w:r>
     </w:p>
@@ -1546,21 +1553,19 @@
         <w:rPr>
           <w:rFonts w:eastAsia="Times New Roman"/>
         </w:rPr>
-        <w:t xml:space="preserve">Couples therapy requires a respectful and emotionally safe environment. If conversations become </w:t>
-      </w:r>
-      <w:r>
-        <w:rPr>
-          <w:rFonts w:eastAsia="Times New Roman"/>
-          <w:b/>
-          <w:bCs/>
-        </w:rPr>
-        <w:t>aggressive, hostile, intimidating, or disrespectful</w:t>
-      </w:r>
-      <w:r>
-        <w:rPr>
-          <w:rFonts w:eastAsia="Times New Roman"/>
-        </w:rPr>
-        <w:t>, I may pause or redirect the discussion to help regulate the interaction and maintain a constructive space. Breaks or topic shifts may occur as needed. Ongoing patterns of intimidation, threats, or abuse may require reassessment of whether couples therapy is appropriate.</w:t>
+        <w:t xml:space="preserve">Couples therapy requires a respectful and emotionally safe environment. If conversations </w:t>
+      </w:r>
+      <w:r>
+        <w:rPr>
+          <w:rFonts w:eastAsia="Times New Roman"/>
+        </w:rPr>
+        <w:t>become aggressive, hostile, intimidating, or disrespectful,</w:t>
+      </w:r>
+      <w:r>
+        <w:rPr>
+          <w:rFonts w:eastAsia="Times New Roman"/>
+        </w:rPr>
+        <w:t xml:space="preserve"> I may pause or redirect the discussion to help regulate the interaction and maintain a constructive space. Breaks or topic shifts may occur as needed. Ongoing patterns of intimidation, threats, or abuse may require reassessment of whether couples therapy is appropriate.</w:t>
       </w:r>
     </w:p>
     <w:p>
@@ -1588,8 +1593,8 @@
           <w:sz w:val="24"/>
           <w:szCs w:val="24"/>
         </w:rPr>
-        <w:pict w14:anchorId="325EA267">
-          <v:rect id="_x0000_i1029" alt="" style="width:362.4pt;height:.05pt;mso-width-percent:0;mso-height-percent:0;mso-width-percent:0;mso-height-percent:0" o:hrpct="803" o:hralign="center" o:hrstd="t" o:hr="t" fillcolor="#a0a0a0" stroked="f"/>
+        <w:pict w14:anchorId="1873742A">
+          <v:rect id="_x0000_i1029" alt="" style="width:347.05pt;height:.05pt;mso-width-percent:0;mso-height-percent:0;mso-width-percent:0;mso-height-percent:0" o:hrpct="769" o:hralign="center" o:hrstd="t" o:hr="t" fillcolor="#a0a0a0" stroked="f"/>
         </w:pict>
       </w:r>
     </w:p>
@@ -1645,16 +1650,14 @@
       <w:r>
         <w:rPr>
           <w:rFonts w:eastAsia="Times New Roman"/>
-          <w:b/>
-          <w:bCs/>
-        </w:rPr>
-        <w:t>neutral and balanced</w:t>
-      </w:r>
-      <w:r>
-        <w:rPr>
-          <w:rFonts w:eastAsia="Times New Roman"/>
-        </w:rPr>
-        <w:t>, supporting the wellbeing of the relationship rather than taking sides. Challenges or interventions are designed to facilitate constructive dialogue and personal reflection, not to assign blame or determine who is “right” or “wrong.”</w:t>
+        </w:rPr>
+        <w:t>neutral and balanced,</w:t>
+      </w:r>
+      <w:r>
+        <w:rPr>
+          <w:rFonts w:eastAsia="Times New Roman"/>
+        </w:rPr>
+        <w:t xml:space="preserve"> supporting the wellbeing of the relationship rather than taking sides. Challenges or interventions are designed to facilitate constructive dialogue and personal reflection, not to assign blame or determine who is “right” or “wrong.”</w:t>
       </w:r>
     </w:p>
     <w:p>
@@ -1682,8 +1685,8 @@
           <w:sz w:val="24"/>
           <w:szCs w:val="24"/>
         </w:rPr>
-        <w:pict w14:anchorId="09991DE5">
-          <v:rect id="_x0000_i1028" alt="" style="width:362.4pt;height:.05pt;mso-width-percent:0;mso-height-percent:0;mso-width-percent:0;mso-height-percent:0" o:hrpct="803" o:hralign="center" o:hrstd="t" o:hr="t" fillcolor="#a0a0a0" stroked="f"/>
+        <w:pict w14:anchorId="5DEB9808">
+          <v:rect id="_x0000_i1028" alt="" style="width:347.05pt;height:.05pt;mso-width-percent:0;mso-height-percent:0;mso-width-percent:0;mso-height-percent:0" o:hrpct="769" o:hralign="center" o:hrstd="t" o:hr="t" fillcolor="#a0a0a0" stroked="f"/>
         </w:pict>
       </w:r>
     </w:p>
@@ -1748,15 +1751,19 @@
         <w:rPr>
           <w:rFonts w:eastAsia="Times New Roman"/>
         </w:rPr>
-        <w:t xml:space="preserve">, such as scheduling or cancellations. Therapeutic discussions, relationship conflicts, or detailed concerns are best addressed during sessions where both partners are present. Individual messages about relationship matters may be brought into therapy and are subject to the </w:t>
-      </w:r>
-      <w:r>
-        <w:rPr>
-          <w:rFonts w:eastAsia="Times New Roman"/>
-          <w:b/>
-          <w:bCs/>
-        </w:rPr>
-        <w:t>No Secrets Policy</w:t>
+        <w:t xml:space="preserve">, such as scheduling or cancellations. Therapeutic discussions, relationship conflicts, or detailed concerns are best addressed during sessions where both partners are present. </w:t>
+      </w:r>
+      <w:r>
+        <w:rPr>
+          <w:rFonts w:eastAsia="Times New Roman"/>
+        </w:rPr>
+        <w:t>The confidentiality principles outlined above for individual sessions also apply to individual message</w:t>
+      </w:r>
+      <w:r>
+        <w:rPr>
+          <w:rFonts w:eastAsia="Times New Roman"/>
+        </w:rPr>
+        <w:t>s</w:t>
       </w:r>
       <w:r>
         <w:rPr>
@@ -1790,8 +1797,8 @@
           <w:sz w:val="24"/>
           <w:szCs w:val="24"/>
         </w:rPr>
-        <w:pict w14:anchorId="2758A036">
-          <v:rect id="_x0000_i1027" alt="" style="width:362.4pt;height:.05pt;mso-width-percent:0;mso-height-percent:0;mso-width-percent:0;mso-height-percent:0" o:hrpct="803" o:hralign="center" o:hrstd="t" o:hr="t" fillcolor="#a0a0a0" stroked="f"/>
+        <w:pict w14:anchorId="454759A7">
+          <v:rect id="_x0000_i1027" alt="" style="width:347.05pt;height:.05pt;mso-width-percent:0;mso-height-percent:0;mso-width-percent:0;mso-height-percent:0" o:hrpct="769" o:hralign="center" o:hrstd="t" o:hr="t" fillcolor="#a0a0a0" stroked="f"/>
         </w:pict>
       </w:r>
     </w:p>
@@ -1842,21 +1849,19 @@
         <w:rPr>
           <w:rFonts w:eastAsia="Times New Roman"/>
         </w:rPr>
-        <w:t xml:space="preserve">Couples therapy is most effective when both partners actively participate and take responsibility for their own behaviours, communication patterns, and contributions to relationship dynamics. Therapy provides guidance, tools, and a structured space for discussion, but meaningful change depends on the </w:t>
-      </w:r>
-      <w:r>
-        <w:rPr>
-          <w:rFonts w:eastAsia="Times New Roman"/>
-          <w:b/>
-          <w:bCs/>
-        </w:rPr>
-        <w:t>efforts and willingness of both partners</w:t>
-      </w:r>
-      <w:r>
-        <w:rPr>
-          <w:rFonts w:eastAsia="Times New Roman"/>
-        </w:rPr>
-        <w:t xml:space="preserve"> to engage both inside and outside of sessions.</w:t>
+        <w:t xml:space="preserve">Couples therapy is most effective when both partners actively participate and take responsibility for their own behaviours, communication patterns, and contributions to relationship dynamics. Therapy provides guidance, tools, and a structured space for discussion, but meaningful change depends on </w:t>
+      </w:r>
+      <w:r>
+        <w:rPr>
+          <w:rFonts w:eastAsia="Times New Roman"/>
+        </w:rPr>
+        <w:t>the efforts and willingness of both partners to engage</w:t>
+      </w:r>
+      <w:r>
+        <w:rPr>
+          <w:rFonts w:eastAsia="Times New Roman"/>
+        </w:rPr>
+        <w:t xml:space="preserve"> both in and outside of sessions.</w:t>
       </w:r>
     </w:p>
     <w:p>
@@ -1884,8 +1889,8 @@
           <w:sz w:val="24"/>
           <w:szCs w:val="24"/>
         </w:rPr>
-        <w:pict w14:anchorId="38209C08">
-          <v:rect id="_x0000_i1026" alt="" style="width:362.4pt;height:.05pt;mso-width-percent:0;mso-height-percent:0;mso-width-percent:0;mso-height-percent:0" o:hrpct="803" o:hralign="center" o:hrstd="t" o:hr="t" fillcolor="#a0a0a0" stroked="f"/>
+        <w:pict w14:anchorId="189F1219">
+          <v:rect id="_x0000_i1026" alt="" style="width:347.05pt;height:.05pt;mso-width-percent:0;mso-height-percent:0;mso-width-percent:0;mso-height-percent:0" o:hrpct="769" o:hralign="center" o:hrstd="t" o:hr="t" fillcolor="#a0a0a0" stroked="f"/>
         </w:pict>
       </w:r>
     </w:p>
@@ -1964,9 +1969,8 @@
           <w:sz w:val="24"/>
           <w:szCs w:val="24"/>
         </w:rPr>
-        <w:lastRenderedPageBreak/>
-        <w:pict w14:anchorId="72C5EF42">
-          <v:rect id="_x0000_i1025" alt="" style="width:362.4pt;height:.05pt;mso-width-percent:0;mso-height-percent:0;mso-width-percent:0;mso-height-percent:0" o:hrpct="803" o:hralign="center" o:hrstd="t" o:hr="t" fillcolor="#a0a0a0" stroked="f"/>
+        <w:pict w14:anchorId="2E8F6806">
+          <v:rect id="_x0000_i1025" alt="" style="width:347.05pt;height:.05pt;mso-width-percent:0;mso-height-percent:0;mso-width-percent:0;mso-height-percent:0" o:hrpct="769" o:hralign="center" o:hrstd="t" o:hr="t" fillcolor="#a0a0a0" stroked="f"/>
         </w:pict>
       </w:r>
     </w:p>
@@ -1982,19 +1986,10 @@
         <w:spacing w:before="240" w:after="240" w:line="240" w:lineRule="auto"/>
         <w:rPr>
           <w:rFonts w:eastAsia="Times New Roman"/>
-          <w:color w:val="auto"/>
-          <w:sz w:val="24"/>
-          <w:szCs w:val="24"/>
-        </w:rPr>
-      </w:pPr>
-      <w:r>
-        <w:rPr>
-          <w:rFonts w:eastAsia="Times New Roman"/>
           <w:b/>
           <w:bCs/>
         </w:rPr>
-        <w:t>If the Couple Separates</w:t>
-      </w:r>
+      </w:pPr>
     </w:p>
     <w:p>
       <w:pPr>
@@ -2016,36 +2011,59 @@
       <w:r>
         <w:rPr>
           <w:rFonts w:eastAsia="Times New Roman"/>
-        </w:rPr>
-        <w:t xml:space="preserve">If the relationship ends during or after therapy, I may not be able to continue seeing </w:t>
-      </w:r>
-      <w:r>
-        <w:rPr>
-          <w:rFonts w:eastAsia="Times New Roman"/>
           <w:b/>
           <w:bCs/>
         </w:rPr>
-        <w:t>one partner individually</w:t>
-      </w:r>
-      <w:r>
-        <w:rPr>
-          <w:rFonts w:eastAsia="Times New Roman"/>
-        </w:rPr>
-        <w:t xml:space="preserve"> due to potential conflicts of interest. In such situations, I may recommend referral to another therapist to ensure professional boundaries and fairness to both parties. If a partner wishes to continue </w:t>
-      </w:r>
-      <w:r>
-        <w:rPr>
-          <w:rFonts w:eastAsia="Times New Roman"/>
-          <w:b/>
-          <w:bCs/>
-        </w:rPr>
-        <w:t>individual therapy after couples therapy ends</w:t>
-      </w:r>
-      <w:r>
-        <w:rPr>
-          <w:rFonts w:eastAsia="Times New Roman"/>
-        </w:rPr>
-        <w:t>, I will provide referrals to qualified therapists for ongoing personal support.</w:t>
+        <w:lastRenderedPageBreak/>
+        <w:t>If the Couple Separates</w:t>
+      </w:r>
+    </w:p>
+    <w:p>
+      <w:pPr>
+        <w:pBdr>
+          <w:top w:val="none" w:sz="0" w:space="0" w:color="auto"/>
+          <w:left w:val="none" w:sz="0" w:space="0" w:color="auto"/>
+          <w:bottom w:val="none" w:sz="0" w:space="0" w:color="auto"/>
+          <w:right w:val="none" w:sz="0" w:space="0" w:color="auto"/>
+          <w:between w:val="none" w:sz="0" w:space="0" w:color="auto"/>
+        </w:pBdr>
+        <w:spacing w:before="240" w:after="240" w:line="240" w:lineRule="auto"/>
+        <w:rPr>
+          <w:rFonts w:eastAsia="Times New Roman"/>
+          <w:color w:val="auto"/>
+          <w:sz w:val="24"/>
+          <w:szCs w:val="24"/>
+        </w:rPr>
+      </w:pPr>
+      <w:r>
+        <w:rPr>
+          <w:rFonts w:eastAsia="Times New Roman"/>
+        </w:rPr>
+        <w:t>If the relationship ends during or after therapy, I may not be able to continue see</w:t>
+      </w:r>
+      <w:r>
+        <w:rPr>
+          <w:rFonts w:eastAsia="Times New Roman"/>
+        </w:rPr>
+        <w:t xml:space="preserve">ing one partner individually due to </w:t>
+      </w:r>
+      <w:r>
+        <w:rPr>
+          <w:rFonts w:eastAsia="Times New Roman"/>
+        </w:rPr>
+        <w:t xml:space="preserve">potential conflicts of interest. In such situations, I may recommend referral to another therapist to ensure professional boundaries and fairness to both parties. If a </w:t>
+      </w:r>
+      <w:r>
+        <w:rPr>
+          <w:rFonts w:eastAsia="Times New Roman"/>
+        </w:rPr>
+        <w:t>partner wishes to continue individual therapy after couples therapy ends, I will</w:t>
+      </w:r>
+      <w:r>
+        <w:rPr>
+          <w:rFonts w:eastAsia="Times New Roman"/>
+        </w:rPr>
+        <w:t xml:space="preserve"> provide referrals to qualified therapists for ongoing personal support.</w:t>
       </w:r>
     </w:p>
     <w:p/>

</xml_diff>